<commit_message>
Normalize AUTO payment and accident FAQs
</commit_message>
<xml_diff>
--- a/18_DOCX/AUTO_FAQ_0028_0037.docx
+++ b/18_DOCX/AUTO_FAQ_0028_0037.docx
@@ -517,7 +517,7 @@
         <w:pStyle w:val="ListBullet"/>
       </w:pPr>
       <w:r>
-        <w:t>Versão: 0.1</w:t>
+        <w:t>Versão: 0.2</w:t>
       </w:r>
     </w:p>
     <w:p>
@@ -541,7 +541,7 @@
         <w:pStyle w:val="ListBullet"/>
       </w:pPr>
       <w:r>
-        <w:t>Histórico: Criação inicial.</w:t>
+        <w:t>Histórico: Criação inicial; reforço NotebookLM e compliance.</w:t>
       </w:r>
     </w:p>
     <w:p>
@@ -604,6 +604,34 @@
           <w:color w:val="4F81BD"/>
           <w:sz w:val="28"/>
         </w:rPr>
+        <w:t>Consulta natural em japonês</w:t>
+      </w:r>
+    </w:p>
+    <w:p>
+      <w:pPr>
+        <w:pStyle w:val="ListBullet"/>
+      </w:pPr>
+      <w:r>
+        <w:t>月払で自動車保険料を支払うことはできますか。</w:t>
+      </w:r>
+    </w:p>
+    <w:p>
+      <w:pPr>
+        <w:pStyle w:val="ListBullet"/>
+      </w:pPr>
+      <w:r>
+        <w:t>月払を希望するブラジル人のお客様に何を確認しますか。</w:t>
+      </w:r>
+    </w:p>
+    <w:p>
+      <w:pPr>
+        <w:pStyle w:val="Heading2"/>
+      </w:pPr>
+      <w:r>
+        <w:rPr>
+          <w:color w:val="4F81BD"/>
+          <w:sz w:val="28"/>
+        </w:rPr>
         <w:t>Situação de atendimento</w:t>
       </w:r>
     </w:p>
@@ -655,6 +683,40 @@
           <w:color w:val="4F81BD"/>
           <w:sz w:val="28"/>
         </w:rPr>
+        <w:t>Próximo passo seguro</w:t>
+      </w:r>
+    </w:p>
+    <w:p>
+      <w:r>
+        <w:t>Confirmar se 月払 está disponível para o produto, qual será o valor mensal, qual forma de cobrança será usada e se existe diferença em relação ao pagamento anual.</w:t>
+      </w:r>
+    </w:p>
+    <w:p>
+      <w:pPr>
+        <w:pStyle w:val="Heading2"/>
+      </w:pPr>
+      <w:r>
+        <w:rPr>
+          <w:color w:val="4F81BD"/>
+          <w:sz w:val="28"/>
+        </w:rPr>
+        <w:t>Limite comercial/compliance</w:t>
+      </w:r>
+    </w:p>
+    <w:p>
+      <w:r>
+        <w:t>O corretor pode explicar a possibilidade de pagamento mensal, mas não deve garantir disponibilidade, valor ou aceitação da forma de cobrança sem confirmação da seguradora.</w:t>
+      </w:r>
+    </w:p>
+    <w:p>
+      <w:pPr>
+        <w:pStyle w:val="Heading2"/>
+      </w:pPr>
+      <w:r>
+        <w:rPr>
+          <w:color w:val="4F81BD"/>
+          <w:sz w:val="28"/>
+        </w:rPr>
         <w:t>Termos relacionados</w:t>
       </w:r>
     </w:p>
@@ -870,6 +932,15 @@
           <w:rFonts w:ascii="Courier New" w:hAnsi="Courier New"/>
           <w:sz w:val="16"/>
         </w:rPr>
+        <w:t>| 2026-06-26 | 0.2 | JP-BR Insurance Knowledge Base | Inclusão de consulta japonesa, próximo passo seguro e limite comercial/compliance. |</w:t>
+      </w:r>
+    </w:p>
+    <w:p>
+      <w:r>
+        <w:rPr>
+          <w:rFonts w:ascii="Courier New" w:hAnsi="Courier New"/>
+          <w:sz w:val="16"/>
+        </w:rPr>
         <w:t>| 2026-06-25 | 0.1 | JP-BR Insurance Knowledge Base | Criação inicial. |</w:t>
       </w:r>
     </w:p>
@@ -903,7 +974,7 @@
         <w:pStyle w:val="ListBullet"/>
       </w:pPr>
       <w:r>
-        <w:t>Versão: 0.1</w:t>
+        <w:t>Versão: 0.2</w:t>
       </w:r>
     </w:p>
     <w:p>
@@ -927,7 +998,7 @@
         <w:pStyle w:val="ListBullet"/>
       </w:pPr>
       <w:r>
-        <w:t>Histórico: Criação inicial.</w:t>
+        <w:t>Histórico: Criação inicial; reforço NotebookLM e compliance.</w:t>
       </w:r>
     </w:p>
     <w:p>
@@ -990,6 +1061,34 @@
           <w:color w:val="4F81BD"/>
           <w:sz w:val="28"/>
         </w:rPr>
+        <w:t>Consulta natural em japonês</w:t>
+      </w:r>
+    </w:p>
+    <w:p>
+      <w:pPr>
+        <w:pStyle w:val="ListBullet"/>
+      </w:pPr>
+      <w:r>
+        <w:t>月払と年払の違いをブラジル人のお客様にどう説明しますか。</w:t>
+      </w:r>
+    </w:p>
+    <w:p>
+      <w:pPr>
+        <w:pStyle w:val="ListBullet"/>
+      </w:pPr>
+      <w:r>
+        <w:t>保険料の支払方法を選ぶとき、何を確認すべきですか。</w:t>
+      </w:r>
+    </w:p>
+    <w:p>
+      <w:pPr>
+        <w:pStyle w:val="Heading2"/>
+      </w:pPr>
+      <w:r>
+        <w:rPr>
+          <w:color w:val="4F81BD"/>
+          <w:sz w:val="28"/>
+        </w:rPr>
         <w:t>Situação de atendimento</w:t>
       </w:r>
     </w:p>
@@ -1041,6 +1140,40 @@
           <w:color w:val="4F81BD"/>
           <w:sz w:val="28"/>
         </w:rPr>
+        <w:t>Próximo passo seguro</w:t>
+      </w:r>
+    </w:p>
+    <w:p>
+      <w:r>
+        <w:t>Comparar valor total, fluxo de pagamento, data de cobrança e regra da seguradora antes de o cliente escolher entre mensal e anual.</w:t>
+      </w:r>
+    </w:p>
+    <w:p>
+      <w:pPr>
+        <w:pStyle w:val="Heading2"/>
+      </w:pPr>
+      <w:r>
+        <w:rPr>
+          <w:color w:val="4F81BD"/>
+          <w:sz w:val="28"/>
+        </w:rPr>
+        <w:t>Limite comercial/compliance</w:t>
+      </w:r>
+    </w:p>
+    <w:p>
+      <w:r>
+        <w:t>O corretor não deve afirmar que uma forma é sempre melhor. A escolha depende do contrato, do valor calculado, da disponibilidade da seguradora e da situação financeira do cliente.</w:t>
+      </w:r>
+    </w:p>
+    <w:p>
+      <w:pPr>
+        <w:pStyle w:val="Heading2"/>
+      </w:pPr>
+      <w:r>
+        <w:rPr>
+          <w:color w:val="4F81BD"/>
+          <w:sz w:val="28"/>
+        </w:rPr>
         <w:t>Termos relacionados</w:t>
       </w:r>
     </w:p>
@@ -1256,6 +1389,15 @@
           <w:rFonts w:ascii="Courier New" w:hAnsi="Courier New"/>
           <w:sz w:val="16"/>
         </w:rPr>
+        <w:t>| 2026-06-26 | 0.2 | JP-BR Insurance Knowledge Base | Inclusão de consulta japonesa, próximo passo seguro e limite comercial/compliance. |</w:t>
+      </w:r>
+    </w:p>
+    <w:p>
+      <w:r>
+        <w:rPr>
+          <w:rFonts w:ascii="Courier New" w:hAnsi="Courier New"/>
+          <w:sz w:val="16"/>
+        </w:rPr>
         <w:t>| 2026-06-25 | 0.1 | JP-BR Insurance Knowledge Base | Criação inicial. |</w:t>
       </w:r>
     </w:p>
@@ -1289,7 +1431,7 @@
         <w:pStyle w:val="ListBullet"/>
       </w:pPr>
       <w:r>
-        <w:t>Versão: 0.1</w:t>
+        <w:t>Versão: 0.2</w:t>
       </w:r>
     </w:p>
     <w:p>
@@ -1313,7 +1455,7 @@
         <w:pStyle w:val="ListBullet"/>
       </w:pPr>
       <w:r>
-        <w:t>Histórico: Criação inicial.</w:t>
+        <w:t>Histórico: Criação inicial; reforço NotebookLM e compliance.</w:t>
       </w:r>
     </w:p>
     <w:p>
@@ -1376,6 +1518,34 @@
           <w:color w:val="4F81BD"/>
           <w:sz w:val="28"/>
         </w:rPr>
+        <w:t>Consulta natural em japonês</w:t>
+      </w:r>
+    </w:p>
+    <w:p>
+      <w:pPr>
+        <w:pStyle w:val="ListBullet"/>
+      </w:pPr>
+      <w:r>
+        <w:t>口座振替ができなかった場合、自動車保険はどうなりますか。</w:t>
+      </w:r>
+    </w:p>
+    <w:p>
+      <w:pPr>
+        <w:pStyle w:val="ListBullet"/>
+      </w:pPr>
+      <w:r>
+        <w:t>引き落としが失敗したブラジル人のお客様にどう案内しますか。</w:t>
+      </w:r>
+    </w:p>
+    <w:p>
+      <w:pPr>
+        <w:pStyle w:val="Heading2"/>
+      </w:pPr>
+      <w:r>
+        <w:rPr>
+          <w:color w:val="4F81BD"/>
+          <w:sz w:val="28"/>
+        </w:rPr>
         <w:t>Situação de atendimento</w:t>
       </w:r>
     </w:p>
@@ -1427,6 +1597,40 @@
           <w:color w:val="4F81BD"/>
           <w:sz w:val="28"/>
         </w:rPr>
+        <w:t>Próximo passo seguro</w:t>
+      </w:r>
+    </w:p>
+    <w:p>
+      <w:r>
+        <w:t>Verificar o motivo da falha, prazo para regularização, canal de pagamento indicado pela seguradora e risco para a cobertura.</w:t>
+      </w:r>
+    </w:p>
+    <w:p>
+      <w:pPr>
+        <w:pStyle w:val="Heading2"/>
+      </w:pPr>
+      <w:r>
+        <w:rPr>
+          <w:color w:val="4F81BD"/>
+          <w:sz w:val="28"/>
+        </w:rPr>
+        <w:t>Limite comercial/compliance</w:t>
+      </w:r>
+    </w:p>
+    <w:p>
+      <w:r>
+        <w:t>O corretor não deve prometer que a cobertura continuará sem impacto. Falha de pagamento pode afetar o contrato conforme prazo, regra da seguradora e situação de regularização.</w:t>
+      </w:r>
+    </w:p>
+    <w:p>
+      <w:pPr>
+        <w:pStyle w:val="Heading2"/>
+      </w:pPr>
+      <w:r>
+        <w:rPr>
+          <w:color w:val="4F81BD"/>
+          <w:sz w:val="28"/>
+        </w:rPr>
         <w:t>Termos relacionados</w:t>
       </w:r>
     </w:p>
@@ -1642,6 +1846,15 @@
           <w:rFonts w:ascii="Courier New" w:hAnsi="Courier New"/>
           <w:sz w:val="16"/>
         </w:rPr>
+        <w:t>| 2026-06-26 | 0.2 | JP-BR Insurance Knowledge Base | Inclusão de consulta japonesa, próximo passo seguro e limite comercial/compliance. |</w:t>
+      </w:r>
+    </w:p>
+    <w:p>
+      <w:r>
+        <w:rPr>
+          <w:rFonts w:ascii="Courier New" w:hAnsi="Courier New"/>
+          <w:sz w:val="16"/>
+        </w:rPr>
         <w:t>| 2026-06-25 | 0.1 | JP-BR Insurance Knowledge Base | Criação inicial. |</w:t>
       </w:r>
     </w:p>
@@ -1675,7 +1888,7 @@
         <w:pStyle w:val="ListBullet"/>
       </w:pPr>
       <w:r>
-        <w:t>Versão: 0.1</w:t>
+        <w:t>Versão: 0.2</w:t>
       </w:r>
     </w:p>
     <w:p>
@@ -1699,7 +1912,7 @@
         <w:pStyle w:val="ListBullet"/>
       </w:pPr>
       <w:r>
-        <w:t>Histórico: Criação inicial.</w:t>
+        <w:t>Histórico: Criação inicial; reforço NotebookLM e compliance.</w:t>
       </w:r>
     </w:p>
     <w:p>
@@ -1762,6 +1975,34 @@
           <w:color w:val="4F81BD"/>
           <w:sz w:val="28"/>
         </w:rPr>
+        <w:t>Consulta natural em japonês</w:t>
+      </w:r>
+    </w:p>
+    <w:p>
+      <w:pPr>
+        <w:pStyle w:val="ListBullet"/>
+      </w:pPr>
+      <w:r>
+        <w:t>自動車保険料をクレジットカードで支払えますか。</w:t>
+      </w:r>
+    </w:p>
+    <w:p>
+      <w:pPr>
+        <w:pStyle w:val="ListBullet"/>
+      </w:pPr>
+      <w:r>
+        <w:t>カード払いを希望するブラジル人のお客様に何を確認しますか。</w:t>
+      </w:r>
+    </w:p>
+    <w:p>
+      <w:pPr>
+        <w:pStyle w:val="Heading2"/>
+      </w:pPr>
+      <w:r>
+        <w:rPr>
+          <w:color w:val="4F81BD"/>
+          <w:sz w:val="28"/>
+        </w:rPr>
         <w:t>Situação de atendimento</w:t>
       </w:r>
     </w:p>
@@ -1813,6 +2054,40 @@
           <w:color w:val="4F81BD"/>
           <w:sz w:val="28"/>
         </w:rPr>
+        <w:t>Próximo passo seguro</w:t>
+      </w:r>
+    </w:p>
+    <w:p>
+      <w:r>
+        <w:t>Confirmar se a seguradora aceita cartão para aquele produto, se o cartão é válido, quem é o titular e quando a cobrança será feita.</w:t>
+      </w:r>
+    </w:p>
+    <w:p>
+      <w:pPr>
+        <w:pStyle w:val="Heading2"/>
+      </w:pPr>
+      <w:r>
+        <w:rPr>
+          <w:color w:val="4F81BD"/>
+          <w:sz w:val="28"/>
+        </w:rPr>
+        <w:t>Limite comercial/compliance</w:t>
+      </w:r>
+    </w:p>
+    <w:p>
+      <w:r>
+        <w:t>O corretor não deve garantir pagamento por cartão sem confirmação. A aceitação depende da seguradora, do produto, do cartão, da titularidade e da regra de cobrança.</w:t>
+      </w:r>
+    </w:p>
+    <w:p>
+      <w:pPr>
+        <w:pStyle w:val="Heading2"/>
+      </w:pPr>
+      <w:r>
+        <w:rPr>
+          <w:color w:val="4F81BD"/>
+          <w:sz w:val="28"/>
+        </w:rPr>
         <w:t>Termos relacionados</w:t>
       </w:r>
     </w:p>
@@ -2028,6 +2303,15 @@
           <w:rFonts w:ascii="Courier New" w:hAnsi="Courier New"/>
           <w:sz w:val="16"/>
         </w:rPr>
+        <w:t>| 2026-06-26 | 0.2 | JP-BR Insurance Knowledge Base | Inclusão de consulta japonesa, próximo passo seguro e limite comercial/compliance. |</w:t>
+      </w:r>
+    </w:p>
+    <w:p>
+      <w:r>
+        <w:rPr>
+          <w:rFonts w:ascii="Courier New" w:hAnsi="Courier New"/>
+          <w:sz w:val="16"/>
+        </w:rPr>
         <w:t>| 2026-06-25 | 0.1 | JP-BR Insurance Knowledge Base | Criação inicial. |</w:t>
       </w:r>
     </w:p>
@@ -2061,7 +2345,7 @@
         <w:pStyle w:val="ListBullet"/>
       </w:pPr>
       <w:r>
-        <w:t>Versão: 0.1</w:t>
+        <w:t>Versão: 0.2</w:t>
       </w:r>
     </w:p>
     <w:p>
@@ -2085,7 +2369,7 @@
         <w:pStyle w:val="ListBullet"/>
       </w:pPr>
       <w:r>
-        <w:t>Histórico: Criação inicial.</w:t>
+        <w:t>Histórico: Criação inicial; reforço NotebookLM e compliance.</w:t>
       </w:r>
     </w:p>
     <w:p>
@@ -2148,6 +2432,34 @@
           <w:color w:val="4F81BD"/>
           <w:sz w:val="28"/>
         </w:rPr>
+        <w:t>Consulta natural em japonês</w:t>
+      </w:r>
+    </w:p>
+    <w:p>
+      <w:pPr>
+        <w:pStyle w:val="ListBullet"/>
+      </w:pPr>
+      <w:r>
+        <w:t>保険料の支払いが遅れた場合、自動車保険はどうなりますか。</w:t>
+      </w:r>
+    </w:p>
+    <w:p>
+      <w:pPr>
+        <w:pStyle w:val="ListBullet"/>
+      </w:pPr>
+      <w:r>
+        <w:t>支払遅延をブラジル人のお客様にどう説明しますか。</w:t>
+      </w:r>
+    </w:p>
+    <w:p>
+      <w:pPr>
+        <w:pStyle w:val="Heading2"/>
+      </w:pPr>
+      <w:r>
+        <w:rPr>
+          <w:color w:val="4F81BD"/>
+          <w:sz w:val="28"/>
+        </w:rPr>
         <w:t>Situação de atendimento</w:t>
       </w:r>
     </w:p>
@@ -2199,6 +2511,40 @@
           <w:color w:val="4F81BD"/>
           <w:sz w:val="28"/>
         </w:rPr>
+        <w:t>Próximo passo seguro</w:t>
+      </w:r>
+    </w:p>
+    <w:p>
+      <w:r>
+        <w:t>Confirmar a data de vencimento, se há prazo de regularização e qual orientação oficial da seguradora para evitar perda de cobertura.</w:t>
+      </w:r>
+    </w:p>
+    <w:p>
+      <w:pPr>
+        <w:pStyle w:val="Heading2"/>
+      </w:pPr>
+      <w:r>
+        <w:rPr>
+          <w:color w:val="4F81BD"/>
+          <w:sz w:val="28"/>
+        </w:rPr>
+        <w:t>Limite comercial/compliance</w:t>
+      </w:r>
+    </w:p>
+    <w:p>
+      <w:r>
+        <w:t>O corretor não deve prometer manutenção da cobertura após atraso. O efeito depende do contrato, do prazo, da regularização e da regra da seguradora.</w:t>
+      </w:r>
+    </w:p>
+    <w:p>
+      <w:pPr>
+        <w:pStyle w:val="Heading2"/>
+      </w:pPr>
+      <w:r>
+        <w:rPr>
+          <w:color w:val="4F81BD"/>
+          <w:sz w:val="28"/>
+        </w:rPr>
         <w:t>Termos relacionados</w:t>
       </w:r>
     </w:p>
@@ -2414,6 +2760,15 @@
           <w:rFonts w:ascii="Courier New" w:hAnsi="Courier New"/>
           <w:sz w:val="16"/>
         </w:rPr>
+        <w:t>| 2026-06-26 | 0.2 | JP-BR Insurance Knowledge Base | Inclusão de consulta japonesa, próximo passo seguro e limite comercial/compliance. |</w:t>
+      </w:r>
+    </w:p>
+    <w:p>
+      <w:r>
+        <w:rPr>
+          <w:rFonts w:ascii="Courier New" w:hAnsi="Courier New"/>
+          <w:sz w:val="16"/>
+        </w:rPr>
         <w:t>| 2026-06-25 | 0.1 | JP-BR Insurance Knowledge Base | Criação inicial. |</w:t>
       </w:r>
     </w:p>
@@ -2447,7 +2802,7 @@
         <w:pStyle w:val="ListBullet"/>
       </w:pPr>
       <w:r>
-        <w:t>Versão: 0.1</w:t>
+        <w:t>Versão: 0.2</w:t>
       </w:r>
     </w:p>
     <w:p>
@@ -2471,7 +2826,7 @@
         <w:pStyle w:val="ListBullet"/>
       </w:pPr>
       <w:r>
-        <w:t>Histórico: Criação inicial.</w:t>
+        <w:t>Histórico: Criação inicial; reforço NotebookLM e compliance.</w:t>
       </w:r>
     </w:p>
     <w:p>
@@ -2534,6 +2889,34 @@
           <w:color w:val="4F81BD"/>
           <w:sz w:val="28"/>
         </w:rPr>
+        <w:t>Consulta natural em japonês</w:t>
+      </w:r>
+    </w:p>
+    <w:p>
+      <w:pPr>
+        <w:pStyle w:val="ListBullet"/>
+      </w:pPr>
+      <w:r>
+        <w:t>払込猶予期間は自動車保険で必ずありますか。</w:t>
+      </w:r>
+    </w:p>
+    <w:p>
+      <w:pPr>
+        <w:pStyle w:val="ListBullet"/>
+      </w:pPr>
+      <w:r>
+        <w:t>支払日に払えないお客様へ猶予期間をどう説明しますか。</w:t>
+      </w:r>
+    </w:p>
+    <w:p>
+      <w:pPr>
+        <w:pStyle w:val="Heading2"/>
+      </w:pPr>
+      <w:r>
+        <w:rPr>
+          <w:color w:val="4F81BD"/>
+          <w:sz w:val="28"/>
+        </w:rPr>
         <w:t>Situação de atendimento</w:t>
       </w:r>
     </w:p>
@@ -2585,6 +2968,40 @@
           <w:color w:val="4F81BD"/>
           <w:sz w:val="28"/>
         </w:rPr>
+        <w:t>Próximo passo seguro</w:t>
+      </w:r>
+    </w:p>
+    <w:p>
+      <w:r>
+        <w:t>Verificar se o contrato possui 払込猶予期間, qual é o prazo e quais consequências ocorrem se o pagamento não for regularizado.</w:t>
+      </w:r>
+    </w:p>
+    <w:p>
+      <w:pPr>
+        <w:pStyle w:val="Heading2"/>
+      </w:pPr>
+      <w:r>
+        <w:rPr>
+          <w:color w:val="4F81BD"/>
+          <w:sz w:val="28"/>
+        </w:rPr>
+        <w:t>Limite comercial/compliance</w:t>
+      </w:r>
+    </w:p>
+    <w:p>
+      <w:r>
+        <w:t>O corretor não deve presumir prazo de tolerância nem orientar o cliente a depender dele. A existência e os efeitos do prazo dependem das condições oficiais do contrato.</w:t>
+      </w:r>
+    </w:p>
+    <w:p>
+      <w:pPr>
+        <w:pStyle w:val="Heading2"/>
+      </w:pPr>
+      <w:r>
+        <w:rPr>
+          <w:color w:val="4F81BD"/>
+          <w:sz w:val="28"/>
+        </w:rPr>
         <w:t>Termos relacionados</w:t>
       </w:r>
     </w:p>
@@ -2800,6 +3217,15 @@
           <w:rFonts w:ascii="Courier New" w:hAnsi="Courier New"/>
           <w:sz w:val="16"/>
         </w:rPr>
+        <w:t>| 2026-06-26 | 0.2 | JP-BR Insurance Knowledge Base | Inclusão de consulta japonesa, próximo passo seguro e limite comercial/compliance. |</w:t>
+      </w:r>
+    </w:p>
+    <w:p>
+      <w:r>
+        <w:rPr>
+          <w:rFonts w:ascii="Courier New" w:hAnsi="Courier New"/>
+          <w:sz w:val="16"/>
+        </w:rPr>
         <w:t>| 2026-06-25 | 0.1 | JP-BR Insurance Knowledge Base | Criação inicial. |</w:t>
       </w:r>
     </w:p>
@@ -2833,7 +3259,7 @@
         <w:pStyle w:val="ListBullet"/>
       </w:pPr>
       <w:r>
-        <w:t>Versão: 0.1</w:t>
+        <w:t>Versão: 0.2</w:t>
       </w:r>
     </w:p>
     <w:p>
@@ -2857,7 +3283,7 @@
         <w:pStyle w:val="ListBullet"/>
       </w:pPr>
       <w:r>
-        <w:t>Histórico: Criação inicial.</w:t>
+        <w:t>Histórico: Criação inicial; reforço NotebookLM e compliance.</w:t>
       </w:r>
     </w:p>
     <w:p>
@@ -2920,6 +3346,34 @@
           <w:color w:val="4F81BD"/>
           <w:sz w:val="28"/>
         </w:rPr>
+        <w:t>Consulta natural em japonês</w:t>
+      </w:r>
+    </w:p>
+    <w:p>
+      <w:pPr>
+        <w:pStyle w:val="ListBullet"/>
+      </w:pPr>
+      <w:r>
+        <w:t>保険料未払いで自動車保険が失効することはありますか。</w:t>
+      </w:r>
+    </w:p>
+    <w:p>
+      <w:pPr>
+        <w:pStyle w:val="ListBullet"/>
+      </w:pPr>
+      <w:r>
+        <w:t>未払いで補償がなくなるリスクをブラジル人のお客様にどう伝えますか。</w:t>
+      </w:r>
+    </w:p>
+    <w:p>
+      <w:pPr>
+        <w:pStyle w:val="Heading2"/>
+      </w:pPr>
+      <w:r>
+        <w:rPr>
+          <w:color w:val="4F81BD"/>
+          <w:sz w:val="28"/>
+        </w:rPr>
         <w:t>Situação de atendimento</w:t>
       </w:r>
     </w:p>
@@ -2971,6 +3425,40 @@
           <w:color w:val="4F81BD"/>
           <w:sz w:val="28"/>
         </w:rPr>
+        <w:t>Próximo passo seguro</w:t>
+      </w:r>
+    </w:p>
+    <w:p>
+      <w:r>
+        <w:t>Checar a situação de pagamento, prazo para regularizar e status do contrato antes de responder se ainda há proteção.</w:t>
+      </w:r>
+    </w:p>
+    <w:p>
+      <w:pPr>
+        <w:pStyle w:val="Heading2"/>
+      </w:pPr>
+      <w:r>
+        <w:rPr>
+          <w:color w:val="4F81BD"/>
+          <w:sz w:val="28"/>
+        </w:rPr>
+        <w:t>Limite comercial/compliance</w:t>
+      </w:r>
+    </w:p>
+    <w:p>
+      <w:r>
+        <w:t>O corretor não deve afirmar que o cliente continua protegido sem verificar o status do contrato. Falta de pagamento pode causar perda de validade e afetar sinistros.</w:t>
+      </w:r>
+    </w:p>
+    <w:p>
+      <w:pPr>
+        <w:pStyle w:val="Heading2"/>
+      </w:pPr>
+      <w:r>
+        <w:rPr>
+          <w:color w:val="4F81BD"/>
+          <w:sz w:val="28"/>
+        </w:rPr>
         <w:t>Termos relacionados</w:t>
       </w:r>
     </w:p>
@@ -3186,6 +3674,15 @@
           <w:rFonts w:ascii="Courier New" w:hAnsi="Courier New"/>
           <w:sz w:val="16"/>
         </w:rPr>
+        <w:t>| 2026-06-26 | 0.2 | JP-BR Insurance Knowledge Base | Inclusão de consulta japonesa, próximo passo seguro e limite comercial/compliance. |</w:t>
+      </w:r>
+    </w:p>
+    <w:p>
+      <w:r>
+        <w:rPr>
+          <w:rFonts w:ascii="Courier New" w:hAnsi="Courier New"/>
+          <w:sz w:val="16"/>
+        </w:rPr>
         <w:t>| 2026-06-25 | 0.1 | JP-BR Insurance Knowledge Base | Criação inicial. |</w:t>
       </w:r>
     </w:p>
@@ -3219,7 +3716,7 @@
         <w:pStyle w:val="ListBullet"/>
       </w:pPr>
       <w:r>
-        <w:t>Versão: 0.1</w:t>
+        <w:t>Versão: 0.2</w:t>
       </w:r>
     </w:p>
     <w:p>
@@ -3243,7 +3740,7 @@
         <w:pStyle w:val="ListBullet"/>
       </w:pPr>
       <w:r>
-        <w:t>Histórico: Criação inicial.</w:t>
+        <w:t>Histórico: Criação inicial; reforço NotebookLM e compliance.</w:t>
       </w:r>
     </w:p>
     <w:p>
@@ -3306,6 +3803,34 @@
           <w:color w:val="4F81BD"/>
           <w:sz w:val="28"/>
         </w:rPr>
+        <w:t>Consulta natural em japonês</w:t>
+      </w:r>
+    </w:p>
+    <w:p>
+      <w:pPr>
+        <w:pStyle w:val="ListBullet"/>
+      </w:pPr>
+      <w:r>
+        <w:t>契約内容変更はどのような場合に必要ですか。</w:t>
+      </w:r>
+    </w:p>
+    <w:p>
+      <w:pPr>
+        <w:pStyle w:val="ListBullet"/>
+      </w:pPr>
+      <w:r>
+        <w:t>住所や運転者が変わったブラジル人のお客様にどう案内しますか。</w:t>
+      </w:r>
+    </w:p>
+    <w:p>
+      <w:pPr>
+        <w:pStyle w:val="Heading2"/>
+      </w:pPr>
+      <w:r>
+        <w:rPr>
+          <w:color w:val="4F81BD"/>
+          <w:sz w:val="28"/>
+        </w:rPr>
         <w:t>Situação de atendimento</w:t>
       </w:r>
     </w:p>
@@ -3357,6 +3882,40 @@
           <w:color w:val="4F81BD"/>
           <w:sz w:val="28"/>
         </w:rPr>
+        <w:t>Próximo passo seguro</w:t>
+      </w:r>
+    </w:p>
+    <w:p>
+      <w:r>
+        <w:t>Confirmar qual informação mudou, quando mudou e se a alteração afeta cobertura, prêmio, condutores, veículo ou forma de pagamento.</w:t>
+      </w:r>
+    </w:p>
+    <w:p>
+      <w:pPr>
+        <w:pStyle w:val="Heading2"/>
+      </w:pPr>
+      <w:r>
+        <w:rPr>
+          <w:color w:val="4F81BD"/>
+          <w:sz w:val="28"/>
+        </w:rPr>
+        <w:t>Limite comercial/compliance</w:t>
+      </w:r>
+    </w:p>
+    <w:p>
+      <w:r>
+        <w:t>O corretor não deve dizer que a alteração não afeta o contrato sem verificar. Dados incorretos podem impactar cobertura, prêmio e análise de sinistro conforme a seguradora.</w:t>
+      </w:r>
+    </w:p>
+    <w:p>
+      <w:pPr>
+        <w:pStyle w:val="Heading2"/>
+      </w:pPr>
+      <w:r>
+        <w:rPr>
+          <w:color w:val="4F81BD"/>
+          <w:sz w:val="28"/>
+        </w:rPr>
         <w:t>Termos relacionados</w:t>
       </w:r>
     </w:p>
@@ -3564,6 +4123,15 @@
           <w:sz w:val="16"/>
         </w:rPr>
         <w:t>| --- | --- | --- | --- |</w:t>
+      </w:r>
+    </w:p>
+    <w:p>
+      <w:r>
+        <w:rPr>
+          <w:rFonts w:ascii="Courier New" w:hAnsi="Courier New"/>
+          <w:sz w:val="16"/>
+        </w:rPr>
+        <w:t>| 2026-06-26 | 0.2 | JP-BR Insurance Knowledge Base | Inclusão de consulta japonesa, próximo passo seguro e limite comercial/compliance. |</w:t>
       </w:r>
     </w:p>
     <w:p>

</xml_diff>